<commit_message>
column fixed and the check now is after the clear
</commit_message>
<xml_diff>
--- a/src/Apps/W1/Quality Management/app/src/Reports/QltyCertificateOfAnalysis.docx
+++ b/src/Apps/W1/Quality Management/app/src/Reports/QltyCertificateOfAnalysis.docx
@@ -907,20 +907,20 @@
           </w:tcPr>
           <w:sdt>
             <w:sdtPr>
-              <w:alias w:val="QltyInspection_Finished_By_User_ID"/>
-              <w:tag w:val="#BC:InsertDataItem,DataItems/CurrentInspection/QltyInspection_Finished_By_User_ID"/>
+              <w:alias w:val="QltyInspection_Finished_By_UserName"/>
+              <w:tag w:val="#BC:InsertDataItem,DataItems/CurrentInspection/QltyInspection_Finished_By_UserName"/>
               <w:id w:val="-140812418"/>
               <w:placeholder>
                 <w:docPart w:val="AFC2392F1BBE448DA23FA9038EFD15A9"/>
               </w:placeholder>
-              <w:dataBinding w:prefixMappings="xmlns:ns0='urn:microsoft-dynamics-nav/reports/Qlty_Certificate_of_Analysis/20401/'" w:xpath="/ns0:NavWordReportXmlPart[1]/ns0:CurrentInspection[1]/ns0:QltyInspection_Finished_By_User_ID[1]" w:storeItemID="{F00BF611-06BA-436C-902A-C0D5E8DF929B}"/>
+              <w:dataBinding w:prefixMappings="xmlns:ns0='urn:microsoft-dynamics-nav/reports/Qlty_Certificate_of_Analysis/20401/'" w:xpath="/ns0:NavWordReportXmlPart[1]/ns0:CurrentInspection[1]/ns0:QltyInspection_Finished_By_UserName[1]" w:storeItemID="{F00BF611-06BA-436C-902A-C0D5E8DF929B}"/>
               <w15:color w:val="808080"/>
               <w:text/>
             </w:sdtPr>
             <w:sdtContent>
               <w:p>
                 <w:r>
-                  <w:t>QltyInspection_Finished_By_User_ID</w:t>
+                  <w:t>QltyInspection_Finished_By_UserName</w:t>
                 </w:r>
               </w:p>
             </w:sdtContent>

</xml_diff>